<commit_message>
docs de ntsce rural y/o urbano ya funciona word y pdf. Plazo de ejcución se meustra bien en los docs, nomenclatura para ntsce corregidos, funcón de papelera implemnetada en configuración
</commit_message>
<xml_diff>
--- a/public/templates/template_contrastes.docx
+++ b/public/templates/template_contrastes.docx
@@ -148,43 +148,15 @@
                       <w:b/>
                       <w:sz w:val="22"/>
                     </w:rPr>
-                    <w:t xml:space="preserve"> </w:t>
+                    <w:t xml:space="preserve"> N°</w:t>
                   </w:r>
-                  <w:proofErr w:type="spellStart"/>
                   <w:r>
                     <w:rPr>
                       <w:rFonts w:ascii="Arial" w:eastAsia="Arial" w:hAnsi="Arial" w:cs="Arial"/>
                       <w:b/>
                       <w:sz w:val="22"/>
                     </w:rPr>
-                    <w:t>N°</w:t>
-                  </w:r>
-                  <w:proofErr w:type="spellEnd"/>
-                  <w:r>
-                    <w:rPr>
-                      <w:rFonts w:ascii="Arial" w:eastAsia="Arial" w:hAnsi="Arial" w:cs="Arial"/>
-                      <w:b/>
-                      <w:sz w:val="22"/>
-                    </w:rPr>
-                    <w:t>{</w:t>
-                  </w:r>
-                  <w:proofErr w:type="spellStart"/>
-                  <w:r>
-                    <w:rPr>
-                      <w:rFonts w:ascii="Arial" w:eastAsia="Arial" w:hAnsi="Arial" w:cs="Arial"/>
-                      <w:b/>
-                      <w:sz w:val="22"/>
-                    </w:rPr>
-                    <w:t>ot</w:t>
-                  </w:r>
-                  <w:proofErr w:type="spellEnd"/>
-                  <w:r>
-                    <w:rPr>
-                      <w:rFonts w:ascii="Arial" w:eastAsia="Arial" w:hAnsi="Arial" w:cs="Arial"/>
-                      <w:b/>
-                      <w:sz w:val="22"/>
-                    </w:rPr>
-                    <w:t>}</w:t>
+                    <w:t>{ot}</w:t>
                   </w:r>
                 </w:p>
               </w:tc>
@@ -209,25 +181,7 @@
                       <w:b/>
                       <w:sz w:val="22"/>
                     </w:rPr>
-                    <w:t>{</w:t>
-                  </w:r>
-                  <w:proofErr w:type="spellStart"/>
-                  <w:r>
-                    <w:rPr>
-                      <w:rFonts w:ascii="Arial" w:eastAsia="Arial" w:hAnsi="Arial" w:cs="Arial"/>
-                      <w:b/>
-                      <w:sz w:val="22"/>
-                    </w:rPr>
-                    <w:t>sk</w:t>
-                  </w:r>
-                  <w:proofErr w:type="spellEnd"/>
-                  <w:r>
-                    <w:rPr>
-                      <w:rFonts w:ascii="Arial" w:eastAsia="Arial" w:hAnsi="Arial" w:cs="Arial"/>
-                      <w:b/>
-                      <w:sz w:val="22"/>
-                    </w:rPr>
-                    <w:t>}</w:t>
+                    <w:t>{sk}</w:t>
                   </w:r>
                 </w:p>
               </w:tc>
@@ -355,17 +309,8 @@
           <w:b/>
           <w:sz w:val="19"/>
         </w:rPr>
-        <w:t xml:space="preserve">CUMPLIMIENTO  </w:t>
-      </w:r>
-      <w:proofErr w:type="gramStart"/>
-      <w:r>
-        <w:rPr>
-          <w:b/>
-          <w:sz w:val="19"/>
-        </w:rPr>
-        <w:t xml:space="preserve">  :</w:t>
-      </w:r>
-      <w:proofErr w:type="gramEnd"/>
+        <w:t>CUMPLIMIENTO    :</w:t>
+      </w:r>
       <w:r>
         <w:rPr>
           <w:b/>
@@ -395,17 +340,8 @@
           <w:b/>
           <w:sz w:val="19"/>
         </w:rPr>
-        <w:t xml:space="preserve">ACTIVIDAD           </w:t>
-      </w:r>
-      <w:proofErr w:type="gramStart"/>
-      <w:r>
-        <w:rPr>
-          <w:b/>
-          <w:sz w:val="19"/>
-        </w:rPr>
-        <w:t xml:space="preserve">  :</w:t>
-      </w:r>
-      <w:proofErr w:type="gramEnd"/>
+        <w:t>ACTIVIDAD             :</w:t>
+      </w:r>
       <w:r>
         <w:rPr>
           <w:b/>
@@ -419,25 +355,7 @@
           <w:color w:val="0000FF"/>
           <w:sz w:val="19"/>
         </w:rPr>
-        <w:t>{</w:t>
-      </w:r>
-      <w:proofErr w:type="spellStart"/>
-      <w:r>
-        <w:rPr>
-          <w:b/>
-          <w:color w:val="0000FF"/>
-          <w:sz w:val="19"/>
-        </w:rPr>
-        <w:t>av</w:t>
-      </w:r>
-      <w:proofErr w:type="spellEnd"/>
-      <w:r>
-        <w:rPr>
-          <w:b/>
-          <w:color w:val="0000FF"/>
-          <w:sz w:val="19"/>
-        </w:rPr>
-        <w:t>}</w:t>
+        <w:t>{av}</w:t>
       </w:r>
     </w:p>
     <w:p>
@@ -453,17 +371,8 @@
           <w:b/>
           <w:sz w:val="19"/>
         </w:rPr>
-        <w:t xml:space="preserve">EDITADO POR      </w:t>
-      </w:r>
-      <w:proofErr w:type="gramStart"/>
-      <w:r>
-        <w:rPr>
-          <w:b/>
-          <w:sz w:val="19"/>
-        </w:rPr>
-        <w:t xml:space="preserve">  :</w:t>
-      </w:r>
-      <w:proofErr w:type="gramEnd"/>
+        <w:t>EDITADO POR        :</w:t>
+      </w:r>
       <w:r>
         <w:rPr>
           <w:b/>
@@ -477,25 +386,7 @@
           <w:color w:val="0000FF"/>
           <w:sz w:val="19"/>
         </w:rPr>
-        <w:t>{</w:t>
-      </w:r>
-      <w:proofErr w:type="spellStart"/>
-      <w:r>
-        <w:rPr>
-          <w:b/>
-          <w:color w:val="0000FF"/>
-          <w:sz w:val="19"/>
-        </w:rPr>
-        <w:t>ed</w:t>
-      </w:r>
-      <w:proofErr w:type="spellEnd"/>
-      <w:r>
-        <w:rPr>
-          <w:b/>
-          <w:color w:val="0000FF"/>
-          <w:sz w:val="19"/>
-        </w:rPr>
-        <w:t>}</w:t>
+        <w:t>{ed}</w:t>
       </w:r>
     </w:p>
     <w:tbl>
@@ -543,7 +434,6 @@
               <w:ind w:left="43" w:right="0" w:firstLine="0"/>
               <w:jc w:val="both"/>
             </w:pPr>
-            <w:proofErr w:type="spellStart"/>
             <w:r>
               <w:rPr>
                 <w:rFonts w:ascii="Arial" w:eastAsia="Arial" w:hAnsi="Arial" w:cs="Arial"/>
@@ -552,7 +442,6 @@
               </w:rPr>
               <w:t>N°</w:t>
             </w:r>
-            <w:proofErr w:type="spellEnd"/>
           </w:p>
         </w:tc>
         <w:tc>
@@ -1023,15 +912,7 @@
         <w:ind w:right="0" w:hanging="235"/>
       </w:pPr>
       <w:r>
-        <w:t xml:space="preserve">Incluye 9 fotos verificación posterior de medidor (Programado y Alternativo), sustentos uso alternativos (Impreso a color 2 ejemplares, constancia oposición y/o constatación policial) Cada primer día hábil entregar suministros desaprobados, suministros alternativos. En archivo </w:t>
-      </w:r>
-      <w:proofErr w:type="spellStart"/>
-      <w:r>
-        <w:t>excel</w:t>
-      </w:r>
-      <w:proofErr w:type="spellEnd"/>
-      <w:r>
-        <w:t>, formato establecido</w:t>
+        <w:t>Incluye 9 fotos verificación posterior de medidor (Programado y Alternativo), sustentos uso alternativos (Impreso a color 2 ejemplares, constancia oposición y/o constatación policial) Cada primer día hábil entregar suministros desaprobados, suministros alternativos. En archivo excel, formato establecido</w:t>
       </w:r>
     </w:p>
     <w:p>
@@ -1043,7 +924,10 @@
         <w:ind w:right="0" w:hanging="235"/>
       </w:pPr>
       <w:r>
-        <w:t>En cumplimiento RM 496-2005-MEM/DM y Resolución 227-2013-OS/CD. Realizar en el día programado bajo responsabilidad, incluye medidores 2012 al 2017</w:t>
+        <w:t>En cumplimiento RM 496-2005-MEM/DM y Resolución 227-2013-OS/CD. Realizar en el día programado bajo responsabilidad, incluye medidores 2012 al 201</w:t>
+      </w:r>
+      <w:r>
+        <w:t>5.</w:t>
       </w:r>
     </w:p>
     <w:p>
@@ -1115,15 +999,7 @@
         <w:t xml:space="preserve">ELECTRÓNICO con copia a CONTROL DE PÉRDIDAS) </w:t>
       </w:r>
       <w:r>
-        <w:t xml:space="preserve">según sea el caso se aplicará estrictamente penalidades y de ser posible retiro del personal involucrado. Presentarse cada inicio de semana a la oficina de cada unidad Zonal debidamente uniformado y con </w:t>
-      </w:r>
-      <w:proofErr w:type="spellStart"/>
-      <w:r>
-        <w:t>fotocheck</w:t>
-      </w:r>
-      <w:proofErr w:type="spellEnd"/>
-      <w:r>
-        <w:t>, BAJO RESPONSABILIDAD</w:t>
+        <w:t>según sea el caso se aplicará estrictamente penalidades y de ser posible retiro del personal involucrado. Presentarse cada inicio de semana a la oficina de cada unidad Zonal debidamente uniformado y con fotocheck, BAJO RESPONSABILIDAD</w:t>
       </w:r>
     </w:p>
     <w:p>
@@ -1138,15 +1014,7 @@
         <w:t>NOTA:</w:t>
       </w:r>
       <w:r>
-        <w:t xml:space="preserve"> {cr} informar diariamente el cumplimiento de la programación con evidencias fotográficas en conformidad a los </w:t>
-      </w:r>
-      <w:proofErr w:type="spellStart"/>
-      <w:r>
-        <w:t>TDRs</w:t>
-      </w:r>
-      <w:proofErr w:type="spellEnd"/>
-      <w:r>
-        <w:t xml:space="preserve"> del contrato suscrito con EPU e informe técnico cada quincena. Supervisar estrictamente </w:t>
+        <w:t xml:space="preserve"> {cr} informar diariamente el cumplimiento de la programación con evidencias fotográficas en conformidad a los TDRs del contrato suscrito con EPU e informe técnico cada quincena. Supervisar estrictamente </w:t>
       </w:r>
       <w:r>
         <w:rPr>

</xml_diff>